<commit_message>
docs(ebook): embed author portrait on About-the-Author page
Add Md. Sohel Sikder portrait (author-photo.png) and rebuild the manuscript
so the photo embeds automatically; placeholder removed.

Co-Authored-By: Claude Opus 4.8 <noreply@anthropic.com>
</commit_message>
<xml_diff>
--- a/ebook/Build-a-World-Class-Website-with-AI.docx
+++ b/ebook/Build-a-World-Class-Website-with-AI.docx
@@ -5360,57 +5360,44 @@
         <w:t>About the Author</w:t>
       </w:r>
     </w:p>
-    <w:tbl>
-      <w:tblPr>
-        <w:tblW w:type="auto" w:w="0"/>
+    <w:p>
+      <w:pPr>
         <w:jc w:val="center"/>
-        <w:tblLook w:firstColumn="1" w:firstRow="1" w:lastColumn="0" w:lastRow="0" w:noHBand="0" w:noVBand="1" w:val="04A0"/>
-      </w:tblPr>
-      <w:tblGrid>
-        <w:gridCol w:w="6696"/>
-      </w:tblGrid>
-      <w:tr>
-        <w:tc>
-          <w:tcPr>
-            <w:tcW w:type="dxa" w:w="6696"/>
-            <w:shd w:val="clear" w:color="auto" w:fill="FAFBFC"/>
-            <w:tcBorders>
-              <w:top w:val="single" w:sz="8" w:color="C9D2DC" w:space="0"/>
-              <w:left w:val="single" w:sz="8" w:color="C9D2DC" w:space="0"/>
-              <w:bottom w:val="single" w:sz="8" w:color="C9D2DC" w:space="0"/>
-              <w:right w:val="single" w:sz="8" w:color="C9D2DC" w:space="0"/>
-            </w:tcBorders>
-            <w:tcMar>
-              <w:top w:w="260" w:type="dxa"/>
-              <w:bottom w:w="260" w:type="dxa"/>
-              <w:start w:w="160" w:type="dxa"/>
-              <w:end w:w="160" w:type="dxa"/>
-            </w:tcMar>
-          </w:tcPr>
-          <w:p>
-            <w:pPr>
-              <w:jc w:val="center"/>
-            </w:pPr>
-            <w:r>
-              <w:rPr>
-                <w:i/>
-                <w:color w:val="445566"/>
-                <w:sz w:val="20"/>
-              </w:rPr>
-              <w:t>[ SCREENSHOT Author ]</w:t>
-              <w:br/>
-              <w:t>Capture: Author portrait — save your photo as ebook/figures/author-photo.jpg and rebuild.</w:t>
-              <w:br/>
-              <w:t>Where: About the Author page</w:t>
-            </w:r>
-          </w:p>
-        </w:tc>
-      </w:tr>
-    </w:tbl>
-    <w:p>
-      <w:pPr>
-        <w:spacing w:after="40"/>
-      </w:pPr>
+      </w:pPr>
+      <w:r>
+        <w:drawing>
+          <wp:inline xmlns:a="http://schemas.openxmlformats.org/drawingml/2006/main" xmlns:pic="http://schemas.openxmlformats.org/drawingml/2006/picture">
+            <wp:extent cx="2011680" cy="2513704"/>
+            <wp:docPr id="8" name="Picture 8"/>
+            <wp:cNvGraphicFramePr>
+              <a:graphicFrameLocks noChangeAspect="1"/>
+            </wp:cNvGraphicFramePr>
+            <a:graphic>
+              <a:graphicData uri="http://schemas.openxmlformats.org/drawingml/2006/picture">
+                <pic:pic>
+                  <pic:nvPicPr>
+                    <pic:cNvPr id="0" name="author-photo.png"/>
+                    <pic:cNvPicPr/>
+                  </pic:nvPicPr>
+                  <pic:blipFill>
+                    <a:blip r:embed="rId18"/>
+                    <a:stretch>
+                      <a:fillRect/>
+                    </a:stretch>
+                  </pic:blipFill>
+                  <pic:spPr>
+                    <a:xfrm>
+                      <a:off x="0" y="0"/>
+                      <a:ext cx="2011680" cy="2513704"/>
+                    </a:xfrm>
+                    <a:prstGeom prst="rect"/>
+                  </pic:spPr>
+                </pic:pic>
+              </a:graphicData>
+            </a:graphic>
+          </wp:inline>
+        </w:drawing>
+      </w:r>
     </w:p>
     <w:p>
       <w:pPr>

</xml_diff>